<commit_message>
Fix 500 error on POST /laundry with safe machine_id, customer_id, and try-catch handling
</commit_message>
<xml_diff>
--- a/Hour_Wash_Quantitative_and_SCM_Assignment_Submission.docx
+++ b/Hour_Wash_Quantitative_and_SCM_Assignment_Submission.docx
@@ -8,7 +8,7 @@
         <w:jc w:val="center"/>
       </w:pPr>
       <w:r>
-        <w:t>ASSIGNMENT SUBMISSION: QUANTITATIVE METHODS &amp; SUPPLY CHAIN MANAGEMENT (SCM) ANALYSIS</w:t>
+        <w:t>HOUR WASH SYSTEM: OVERALL ROLE DASHBOARD &amp; SCM QUANTITATIVE ANALYSIS</w:t>
       </w:r>
     </w:p>
     <w:p>
@@ -18,7 +18,7 @@
       <w:r>
         <w:t>System: Hour Wash Laundry Management System (hourwashweb)</w:t>
         <w:br/>
-        <w:t>Date: August 20, 2026</w:t>
+        <w:t>Dashboards Covered: Admin, Staff, Rider, and Customer Portals</w:t>
         <w:br/>
       </w:r>
     </w:p>
@@ -27,24 +27,7 @@
         <w:pStyle w:val="Heading1"/>
       </w:pPr>
       <w:r>
-        <w:t>SECTION 1: QUANTITATIVE METHODS CLASSIFICATION</w:t>
-      </w:r>
-    </w:p>
-    <w:p>
-      <w:r>
-        <w:rPr>
-          <w:color w:val="333333"/>
-        </w:rPr>
-        <w:t xml:space="preserve">The Hour Wash Laundry Management System is classified as a </w:t>
-      </w:r>
-      <w:r>
-        <w:rPr>
-          <w:b/>
-        </w:rPr>
-        <w:t>Hybrid Quantitative Decision Support System</w:t>
-      </w:r>
-      <w:r>
-        <w:t>. It incorporates all three core quantitative analytics paradigms: Descriptive, Predictive, and Prescriptive Analytics.</w:t>
+        <w:t>SECTION 1: OVERALL SYSTEM DASHBOARD BREAKDOWN (ADMIN, STAFF, RIDER, CUSTOMER)</w:t>
       </w:r>
     </w:p>
     <w:p>
@@ -52,37 +35,37 @@
         <w:pStyle w:val="Heading2"/>
       </w:pPr>
       <w:r>
-        <w:t>1. Descriptive Analytics ("What has happened &amp; what is currently happening?")</w:t>
+        <w:t>1. Admin &amp; Manager Dashboard (/admin/dashboard &amp; /admin/analytics)</w:t>
       </w:r>
     </w:p>
     <w:p>
       <w:r>
-        <w:t>• Definition: Analyzes historical and current transactional data to answer "What has happened?" and "What is currently happening in the store?"</w:t>
+        <w:t>• Dashboard Role: Strategic Management, Financial Oversight &amp; Store Capacity Control.</w:t>
       </w:r>
     </w:p>
     <w:p>
       <w:r>
-        <w:t>• System Location: Admin &amp; Owner Dashboard (/admin/dashboard -&gt; AnalyticsController.php), Machine Monitor (/admin/machines), AI Chatbot Metrics Engine (ChatbotController.php).</w:t>
+        <w:t>• Quantitative Analytics Featured:</w:t>
       </w:r>
     </w:p>
     <w:p>
       <w:r>
-        <w:t>• Quantitative Formulas &amp; Variables:</w:t>
+        <w:t xml:space="preserve">   - Descriptive: Total Revenue = ∑(total_amount | paid), Fleet Utilization % = (Active / Total) × 100%, Total User Count, and Order Pipeline Breakdown (pending, washing, drying, finish, completed).</w:t>
       </w:r>
     </w:p>
     <w:p>
       <w:r>
-        <w:t xml:space="preserve">   - Total Store Revenue: Total Revenue = ∑ (total_amount | payment_status = "paid")</w:t>
+        <w:t xml:space="preserve">   - Predictive: Store turnaround trends &amp; daily booking volume forecasting.</w:t>
       </w:r>
     </w:p>
     <w:p>
       <w:r>
-        <w:t xml:space="preserve">   - Machine Fleet Utilization Rate: Fleet Utilization % = (Active Machines / Total Machines) × 100%</w:t>
+        <w:t xml:space="preserve">   - Prescriptive: 4:30 PM Cut-off Policy enforcement, store open/closed toggles, and machine maintenance status control.</w:t>
       </w:r>
     </w:p>
     <w:p>
       <w:r>
-        <w:t xml:space="preserve">   - Order Queue Status Breakdown: Counts of orders in stages (N_pending, N_washing, N_drying, N_finish, N_completed).</w:t>
+        <w:t>• SCM Functional Area &amp; Process: Property, Facility &amp; Finance Operations — Managing financial records, machine asset health, and staff/rider account allocations.</w:t>
       </w:r>
     </w:p>
     <w:p>
@@ -90,37 +73,37 @@
         <w:pStyle w:val="Heading2"/>
       </w:pPr>
       <w:r>
-        <w:t>2. Predictive Analytics ("What is expected to happen?")</w:t>
+        <w:t>2. Staff &amp; Store Operator Dashboard (/admin/laundry &amp; /admin/machines)</w:t>
       </w:r>
     </w:p>
     <w:p>
       <w:r>
-        <w:t>• Definition: Uses service parameters and current queue workload to forecast "What is expected to happen?"</w:t>
+        <w:t>• Dashboard Role: Inbound Processing, Machine Dispatch &amp; Quality Control.</w:t>
       </w:r>
     </w:p>
     <w:p>
       <w:r>
-        <w:t>• System Location: Order Booking &amp; ETA Estimation Engine (app/Models/Service.php, LaundryController.php), Live QR Code Customer Tracker (/laundry/track/{order}).</w:t>
+        <w:t>• Quantitative Analytics Featured:</w:t>
       </w:r>
     </w:p>
     <w:p>
       <w:r>
-        <w:t>• Quantitative Formulas &amp; Variables:</w:t>
+        <w:t xml:space="preserve">   - Descriptive: Real-time machine digital timers, live wash cycle monitoring, order queue status per machine.</w:t>
       </w:r>
     </w:p>
     <w:p>
       <w:r>
-        <w:t xml:space="preserve">   - Estimated Time of Arrival / Completion (ETA):</w:t>
+        <w:t xml:space="preserve">   - Predictive: Live estimated completion countdowns (estimated_minutes) per active order load.</w:t>
       </w:r>
     </w:p>
     <w:p>
       <w:r>
-        <w:t xml:space="preserve">     ETA = T_creation + t_service + (N_queue × t_avg_cycle)</w:t>
+        <w:t xml:space="preserve">   - Prescriptive: Automated machine assignment logic (allocates lowest-workload idle machine) and 12-stamp discount token redemption during walk-in entry.</w:t>
       </w:r>
     </w:p>
     <w:p>
       <w:r>
-        <w:t xml:space="preserve">     Durations: Wash Only ~35 mins | Dry Only ~40 mins | Self-Service ~75 mins | Full-Service ~90 mins.</w:t>
+        <w:t>• SCM Functional Area &amp; Process: Facility Operations &amp; Production Intake — Weighing incoming loads (7kg limit), scanning QR code tags, transitioning states (washing -&gt; rinsing -&gt; drying -&gt; finish), and packaging completed orders.</w:t>
       </w:r>
     </w:p>
     <w:p>
@@ -128,47 +111,75 @@
         <w:pStyle w:val="Heading2"/>
       </w:pPr>
       <w:r>
-        <w:t>3. Prescriptive Analytics ("What automated action should be taken?")</w:t>
+        <w:t>3. Rider Logistics Dashboard (/rider/dashboard)</w:t>
       </w:r>
     </w:p>
     <w:p>
       <w:r>
-        <w:t>• Definition: Evaluates business constraints and policies to determine "What automated action should be taken?"</w:t>
+        <w:t>• Dashboard Role: Inbound &amp; Outbound Delivery Dispatch &amp; Doorstep Fulfillment.</w:t>
       </w:r>
     </w:p>
     <w:p>
       <w:r>
-        <w:t>• System Location: Automated Loyalty Stamp Card Engine (app/Models/User.php -&gt; addStamp()), 4:30 PM Cut-Off Policy Engine (welcome.blade.php, LaundryController.php), Automated Machine Dispatcher (AdminLaundryController.php).</w:t>
+        <w:t>• Quantitative Analytics Featured:</w:t>
       </w:r>
     </w:p>
     <w:p>
       <w:r>
-        <w:t>• Quantitative Formulas &amp; Variables:</w:t>
+        <w:t xml:space="preserve">   - Descriptive: Active Pickup Requests Count (N_pickup), Received Count (N_received), Out-for-Delivery Count (N_delivery), and Completed Today Counter.</w:t>
       </w:r>
     </w:p>
     <w:p>
       <w:r>
-        <w:t xml:space="preserve">   - 12-Stamp Loyalty Card Auto-Reset Logic:</w:t>
+        <w:t xml:space="preserve">   - Predictive: Arrival time windows based on customer doorstep address and barangay location.</w:t>
       </w:r>
     </w:p>
     <w:p>
       <w:r>
-        <w:t xml:space="preserve">     Stamps_new = stamps_count + 1</w:t>
+        <w:t xml:space="preserve">   - Prescriptive: Priority dispatch queueing and automated SMS customer notification triggers upon pickup/delivery updates.</w:t>
       </w:r>
     </w:p>
     <w:p>
       <w:r>
-        <w:t xml:space="preserve">     IF Stamps_new ≥ 12 ⟹ [completed_cards = completed_cards + 1, discount_rewards = discount_rewards + 1 (₱50.00 OFF Token), stamps_count = 0 (Reset)]</w:t>
+        <w:t>• SCM Functional Area &amp; Process: Outbound Logistics &amp; Distribution — Collecting laundry from customer locations (out_for_pickup -&gt; received) and delivering finished laundry (out_for_delivery -&gt; completed).</w:t>
+      </w:r>
+    </w:p>
+    <w:p>
+      <w:pPr>
+        <w:pStyle w:val="Heading2"/>
+      </w:pPr>
+      <w:r>
+        <w:t>4. Customer Portal &amp; Tracking Dashboard (/my-orders &amp; /laundry/track/{order})</w:t>
       </w:r>
     </w:p>
     <w:p>
       <w:r>
-        <w:t xml:space="preserve">   - Automated 4:30 PM Same-Day Cut-Off Rule:</w:t>
+        <w:t>• Dashboard Role: Demand Generation, Self-Service Booking &amp; Order Tracking.</w:t>
       </w:r>
     </w:p>
     <w:p>
       <w:r>
-        <w:t xml:space="preserve">     IF T_booking &gt; 16:30 ⟹ Enforce "Next-Day Processing Guarantee"</w:t>
+        <w:t>• Quantitative Analytics Featured:</w:t>
+      </w:r>
+    </w:p>
+    <w:p>
+      <w:r>
+        <w:t xml:space="preserve">   - Descriptive: Frequent User Stamp Card (X/12), completed cards count, available ₱50.00 discount tokens.</w:t>
+      </w:r>
+    </w:p>
+    <w:p>
+      <w:r>
+        <w:t xml:space="preserve">   - Predictive: Dynamic completion countdown tracker (estimated_completion timer via QR tag).</w:t>
+      </w:r>
+    </w:p>
+    <w:p>
+      <w:r>
+        <w:t xml:space="preserve">   - Prescriptive: Automated 12-stamp reward token application (₱50.00 OFF) and Tipid supply choice selection (-₱15.00 / -₱25.00).</w:t>
+      </w:r>
+    </w:p>
+    <w:p>
+      <w:r>
+        <w:t>• SCM Functional Area &amp; Process: Customer Relationship Management (CRM) — Submitting online bookings, tracking live status, redeeming rewards, and rating services.</w:t>
       </w:r>
     </w:p>
     <w:p>
@@ -176,179 +187,7 @@
         <w:pStyle w:val="Heading1"/>
       </w:pPr>
       <w:r>
-        <w:t>SECTION 2: SUPPLY CHAIN MANAGEMENT (SCM) ANALYSIS</w:t>
-      </w:r>
-    </w:p>
-    <w:p>
-      <w:r>
-        <w:rPr>
-          <w:b/>
-        </w:rPr>
-        <w:t>Functional Area:</w:t>
-        <w:br/>
-      </w:r>
-      <w:r>
-        <w:t>- Property, Facility &amp; Equipment Operations</w:t>
-        <w:br/>
-        <w:br/>
-      </w:r>
-      <w:r>
-        <w:rPr>
-          <w:b/>
-        </w:rPr>
-        <w:t>Business Function:</w:t>
-        <w:br/>
-      </w:r>
-      <w:r>
-        <w:t>- Machine Maintenance &amp; Capacity Management</w:t>
-        <w:br/>
-        <w:br/>
-      </w:r>
-      <w:r>
-        <w:rPr>
-          <w:b/>
-        </w:rPr>
-        <w:t>Business Process:</w:t>
-        <w:br/>
-      </w:r>
-      <w:r>
-        <w:t>- Managing physical store equipment, washers, dryers, and laundry working spaces.</w:t>
-        <w:br/>
-        <w:t>- Inspecting machine operational statuses (idle, washing, drying, maintenance, offline).</w:t>
-        <w:br/>
-        <w:t>- Monitoring machine fleet occupancy, availability, and utilization rate.</w:t>
-      </w:r>
-    </w:p>
-    <w:p>
-      <w:r>
-        <w:rPr>
-          <w:b/>
-        </w:rPr>
-        <w:t>Functional Area:</w:t>
-        <w:br/>
-      </w:r>
-      <w:r>
-        <w:t>- Finance &amp; Accounting</w:t>
-        <w:br/>
-        <w:br/>
-      </w:r>
-      <w:r>
-        <w:rPr>
-          <w:b/>
-        </w:rPr>
-        <w:t>Business Function:</w:t>
-        <w:br/>
-      </w:r>
-      <w:r>
-        <w:t>- Order Billing &amp; Payment Reconciliation</w:t>
-        <w:br/>
-        <w:br/>
-      </w:r>
-      <w:r>
-        <w:rPr>
-          <w:b/>
-        </w:rPr>
-        <w:t>Business Process:</w:t>
-        <w:br/>
-      </w:r>
-      <w:r>
-        <w:t>- Calculating order costs based on laundry weight (7kg max load limit per cycle) and service type.</w:t>
-        <w:br/>
-        <w:t>- Managing unpaid/paid order transactions, cash payments, and digital receipts.</w:t>
-        <w:br/>
-        <w:t>- Monitoring total store revenue, daily sales performance, and customer transaction balances.</w:t>
-      </w:r>
-    </w:p>
-    <w:p>
-      <w:r>
-        <w:rPr>
-          <w:b/>
-        </w:rPr>
-        <w:t>Functional Area:</w:t>
-        <w:br/>
-      </w:r>
-      <w:r>
-        <w:t>- Marketing &amp; Customer Relations (CRM)</w:t>
-        <w:br/>
-        <w:br/>
-      </w:r>
-      <w:r>
-        <w:rPr>
-          <w:b/>
-        </w:rPr>
-        <w:t>Business Function:</w:t>
-        <w:br/>
-      </w:r>
-      <w:r>
-        <w:t>- Marketing, Promotions &amp; Loyalty Engagement</w:t>
-        <w:br/>
-        <w:br/>
-      </w:r>
-      <w:r>
-        <w:rPr>
-          <w:b/>
-        </w:rPr>
-        <w:t>Business Process:</w:t>
-        <w:br/>
-      </w:r>
-      <w:r>
-        <w:t>- Attracting potential customers through the online web landing page.</w:t>
-        <w:br/>
-        <w:t>- Advertising laundry packages (Wash Only, Dry Only, Wash &amp; Dry Combo, Self-Service, Full-Service).</w:t>
-        <w:br/>
-        <w:t>- Managing promotions, supply choice discounts (own detergent/softener), and 12-stamp loyalty card rewards (₱50.00 OFF).</w:t>
-        <w:br/>
-        <w:t>- Collecting customer feedback, 1–5 star ratings, and online reviews.</w:t>
-      </w:r>
-    </w:p>
-    <w:p>
-      <w:r>
-        <w:rPr>
-          <w:b/>
-        </w:rPr>
-        <w:t>Functional Area:</w:t>
-        <w:br/>
-      </w:r>
-      <w:r>
-        <w:t>- Customer &amp; Rider Services</w:t>
-        <w:br/>
-        <w:br/>
-      </w:r>
-      <w:r>
-        <w:rPr>
-          <w:b/>
-        </w:rPr>
-        <w:t>Business Function:</w:t>
-        <w:br/>
-      </w:r>
-      <w:r>
-        <w:t>- Order Booking &amp; Dispatch Management</w:t>
-        <w:br/>
-        <w:br/>
-      </w:r>
-      <w:r>
-        <w:rPr>
-          <w:b/>
-        </w:rPr>
-        <w:t>Business Process:</w:t>
-        <w:br/>
-      </w:r>
-      <w:r>
-        <w:t>- Receiving and responding to customer questions about laundry services via the AI Chatbot.</w:t>
-        <w:br/>
-        <w:t>- Verifying customer/walk-in information (name, address, barangay, phone number).</w:t>
-        <w:br/>
-        <w:t>- Approving and processing order bookings (enforcing the 4:30 PM cut-off rule and store status).</w:t>
-        <w:br/>
-        <w:t>- Sending automated booking confirmations, dynamic QR tracking tags, and SMS/Email notifications.</w:t>
-      </w:r>
-    </w:p>
-    <w:p>
-      <w:pPr>
-        <w:pStyle w:val="Heading1"/>
-      </w:pPr>
-      <w:r>
-        <w:t>SECTION 3: SCM BUSINESS PROCESS &amp; ROLE MATRIX</w:t>
+        <w:t>SECTION 2: OVERALL ROLE DASHBOARD &amp; SCM QUANTITATIVE MATRIX</w:t>
       </w:r>
     </w:p>
     <w:tbl>
@@ -373,7 +212,7 @@
               <w:rPr>
                 <w:b/>
               </w:rPr>
-              <w:t>Functional Area</w:t>
+              <w:t>Role &amp; Dashboard</w:t>
             </w:r>
           </w:p>
         </w:tc>
@@ -386,7 +225,7 @@
               <w:rPr>
                 <w:b/>
               </w:rPr>
-              <w:t>Business Function</w:t>
+              <w:t>SCM Functional Area</w:t>
             </w:r>
           </w:p>
         </w:tc>
@@ -399,7 +238,7 @@
               <w:rPr>
                 <w:b/>
               </w:rPr>
-              <w:t>Input Variables / System Process</w:t>
+              <w:t>Quantitative Method Featured</w:t>
             </w:r>
           </w:p>
         </w:tc>
@@ -412,7 +251,7 @@
               <w:rPr>
                 <w:b/>
               </w:rPr>
-              <w:t>Business Outputs &amp; KPIs</w:t>
+              <w:t>Key Dashboard Processes</w:t>
             </w:r>
           </w:p>
         </w:tc>
@@ -424,7 +263,9 @@
           </w:tcPr>
           <w:p>
             <w:r>
-              <w:t>Facility &amp; Equipment Operations</w:t>
+              <w:t>Admin Dashboard</w:t>
+              <w:br/>
+              <w:t>(/admin/dashboard)</w:t>
             </w:r>
           </w:p>
         </w:tc>
@@ -434,7 +275,7 @@
           </w:tcPr>
           <w:p>
             <w:r>
-              <w:t>Machine Maintenance &amp; Capacity Management</w:t>
+              <w:t>Property, Facility &amp; Finance Operations</w:t>
             </w:r>
           </w:p>
         </w:tc>
@@ -444,9 +285,9 @@
           </w:tcPr>
           <w:p>
             <w:r>
-              <w:t>Inputs: Service Type, Machine Availability</w:t>
+              <w:t>Descriptive: Total Revenue, Utilization %</w:t>
               <w:br/>
-              <w:t>Logic: Assigns idle machine with lowest workload, triggers timer.</w:t>
+              <w:t>Prescriptive: 4:30 PM Cut-off, Machine Maintenance</w:t>
             </w:r>
           </w:p>
         </w:tc>
@@ -456,9 +297,11 @@
           </w:tcPr>
           <w:p>
             <w:r>
-              <w:t>Outputs: Active Machine Cycle, Live Status</w:t>
+              <w:t>• Monitors revenue &amp; fleet usage</w:t>
               <w:br/>
-              <w:t>KPIs: Fleet Utilization %, Turnaround Time</w:t>
+              <w:t>• Manages machine asset statuses</w:t>
+              <w:br/>
+              <w:t>• Oversees staff &amp; system parameters</w:t>
             </w:r>
           </w:p>
         </w:tc>
@@ -470,7 +313,9 @@
           </w:tcPr>
           <w:p>
             <w:r>
-              <w:t>Finance &amp; Accounting</w:t>
+              <w:t>Staff Dashboard</w:t>
+              <w:br/>
+              <w:t>(/admin/laundry)</w:t>
             </w:r>
           </w:p>
         </w:tc>
@@ -480,7 +325,7 @@
           </w:tcPr>
           <w:p>
             <w:r>
-              <w:t>Order Billing &amp; Payment Reconciliation</w:t>
+              <w:t>Operations &amp; Facility Intake</w:t>
             </w:r>
           </w:p>
         </w:tc>
@@ -490,9 +335,9 @@
           </w:tcPr>
           <w:p>
             <w:r>
-              <w:t>Inputs: Weight (kg), Service Price, Supplies Discount</w:t>
+              <w:t>Descriptive: Active timers, Queue status</w:t>
               <w:br/>
-              <w:t>Logic: Subtotal = Price * Load, applies ₱50 OFF token.</w:t>
+              <w:t>Prescriptive: Auto machine dispatch</w:t>
             </w:r>
           </w:p>
         </w:tc>
@@ -502,9 +347,11 @@
           </w:tcPr>
           <w:p>
             <w:r>
-              <w:t>Outputs: Digital Invoice Receipt, Payment Status</w:t>
+              <w:t>• Weighs laundry (7kg limit)</w:t>
               <w:br/>
-              <w:t>KPIs: Total Revenue, Payment Accuracy %</w:t>
+              <w:t>• Scans QR tags &amp; controls wash cycles</w:t>
+              <w:br/>
+              <w:t>• Triggers SMS/Email packaging alerts</w:t>
             </w:r>
           </w:p>
         </w:tc>
@@ -516,7 +363,9 @@
           </w:tcPr>
           <w:p>
             <w:r>
-              <w:t>Marketing &amp; CRM</w:t>
+              <w:t>Rider Dashboard</w:t>
+              <w:br/>
+              <w:t>(/rider/dashboard)</w:t>
             </w:r>
           </w:p>
         </w:tc>
@@ -526,7 +375,7 @@
           </w:tcPr>
           <w:p>
             <w:r>
-              <w:t>Promotions &amp; Loyalty Engagement</w:t>
+              <w:t>Inbound &amp; Outbound Logistics Distribution</w:t>
             </w:r>
           </w:p>
         </w:tc>
@@ -536,9 +385,9 @@
           </w:tcPr>
           <w:p>
             <w:r>
-              <w:t>Inputs: Completed Order Event</w:t>
+              <w:t>Descriptive: Pickup/Delivery task metrics</w:t>
               <w:br/>
-              <w:t>Logic: Stamps + 1. At 12 stamps, resets to 0 and issues ₱50 OFF token.</w:t>
+              <w:t>Prescriptive: Auto SMS delivery alerts</w:t>
             </w:r>
           </w:p>
         </w:tc>
@@ -548,9 +397,11 @@
           </w:tcPr>
           <w:p>
             <w:r>
-              <w:t>Outputs: Updated Stamp Card (X/12), ₱50 Token</w:t>
+              <w:t>• Accepts pickup requests (out_for_pickup)</w:t>
               <w:br/>
-              <w:t>KPIs: Customer Repeat Rate %, Reward Redemption %</w:t>
+              <w:t>• Delivers clean laundry (out_for_delivery)</w:t>
+              <w:br/>
+              <w:t>• Updates order status to completed</w:t>
             </w:r>
           </w:p>
         </w:tc>
@@ -562,7 +413,9 @@
           </w:tcPr>
           <w:p>
             <w:r>
-              <w:t>Customer &amp; Rider Services</w:t>
+              <w:t>Customer Portal</w:t>
+              <w:br/>
+              <w:t>(/my-orders &amp; /track)</w:t>
             </w:r>
           </w:p>
         </w:tc>
@@ -572,7 +425,7 @@
           </w:tcPr>
           <w:p>
             <w:r>
-              <w:t>Order Booking &amp; Dispatch Management</w:t>
+              <w:t>CRM &amp; Demand Booking Intake</w:t>
             </w:r>
           </w:p>
         </w:tc>
@@ -582,9 +435,9 @@
           </w:tcPr>
           <w:p>
             <w:r>
-              <w:t>Inputs: Customer Address, Weight, 4:30 PM Time</w:t>
+              <w:t>Predictive: Live QR completion ETA</w:t>
               <w:br/>
-              <w:t>Logic: Validates 7kg load, checks 4:30 PM cutoff, dispatches Rider.</w:t>
+              <w:t>Prescriptive: 12-Stamp ₱50 OFF token logic</w:t>
             </w:r>
           </w:p>
         </w:tc>
@@ -594,9 +447,11 @@
           </w:tcPr>
           <w:p>
             <w:r>
-              <w:t>Outputs: Order Record (#HW-0001), QR Tag, SMS/Email</w:t>
+              <w:t>• Books laundry orders online</w:t>
               <w:br/>
-              <w:t>KPIs: Daily Order Volume, On-Time Delivery %</w:t>
+              <w:t>• Scans QR code for live tracking</w:t>
+              <w:br/>
+              <w:t>• Collects stamps &amp; redeems ₱50 tokens</w:t>
             </w:r>
           </w:p>
         </w:tc>

</xml_diff>